<commit_message>
Session 4: docs/RELATED_WORK.md; remove or back every gap claim in the white papers
Nine entries (SDG 17.14.1, Sovereign ESG, WGI, Miles 2002, Breitmeier 2006 and 2011,
OxCGRT, early-warning reviews, ESG Project), each with what was opened and what is unverified.
Gap register G1-G12: 10 claims removed or reworded, 1 backed (E8), external coverage facts kept.

Co-Authored-By: Claude Opus 5.5 <noreply@anthropic.com>
Claude-Session: https://claude.ai/code/session_015tYfLWUn7wCsxHyc3ScS9w
</commit_message>
<xml_diff>
--- a/WHITEPAPER_EMO_v1_Why_EMO_Must_Run_Continuously.md.docx
+++ b/WHITEPAPER_EMO_v1_Why_EMO_Must_Run_Continuously.md.docx
@@ -427,124 +427,25 @@
           <w:kern w:val="0"/>
           <w14:ligatures w14:val="none"/>
         </w:rPr>
-        <w:t>Yet one layer is still missing.</w:t>
-      </w:r>
-    </w:p>
-    <w:p>
-      <w:pPr>
-        <w:spacing w:before="100" w:beforeAutospacing="1" w:after="100" w:afterAutospacing="1" w:line="240" w:lineRule="auto"/>
-        <w:rPr>
-          <w:rFonts w:ascii="Cambria" w:eastAsia="Times New Roman" w:hAnsi="Cambria" w:cs="Times New Roman"/>
-          <w:kern w:val="0"/>
-          <w14:ligatures w14:val="none"/>
-        </w:rPr>
-      </w:pPr>
-      <w:r>
-        <w:rPr>
-          <w:rFonts w:ascii="Cambria" w:eastAsia="Times New Roman" w:hAnsi="Cambria" w:cs="Times New Roman"/>
-          <w:kern w:val="0"/>
-          <w14:ligatures w14:val="none"/>
-        </w:rPr>
-        <w:t>We can now see what the planet is doing in unprecedented detail.</w:t>
-      </w:r>
-      <w:r>
-        <w:rPr>
-          <w:rFonts w:ascii="Cambria" w:eastAsia="Times New Roman" w:hAnsi="Cambria" w:cs="Times New Roman"/>
-          <w:kern w:val="0"/>
-          <w14:ligatures w14:val="none"/>
-        </w:rPr>
-        <w:br/>
-        <w:t xml:space="preserve">We still lack an instrument that measures </w:t>
-      </w:r>
-      <w:r>
-        <w:rPr>
-          <w:rFonts w:ascii="Cambria" w:eastAsia="Times New Roman" w:hAnsi="Cambria" w:cs="Times New Roman"/>
-          <w:b/>
-          <w:bCs/>
-          <w:kern w:val="0"/>
-          <w14:ligatures w14:val="none"/>
-        </w:rPr>
-        <w:t>how well the human species is thinking and acting in response.</w:t>
-      </w:r>
-    </w:p>
-    <w:p>
-      <w:pPr>
-        <w:spacing w:before="100" w:beforeAutospacing="1" w:after="100" w:afterAutospacing="1" w:line="240" w:lineRule="auto"/>
-        <w:rPr>
-          <w:rFonts w:ascii="Cambria" w:eastAsia="Times New Roman" w:hAnsi="Cambria" w:cs="Times New Roman"/>
-          <w:kern w:val="0"/>
-          <w14:ligatures w14:val="none"/>
-        </w:rPr>
-      </w:pPr>
-      <w:r>
-        <w:rPr>
-          <w:rFonts w:ascii="Cambria" w:eastAsia="Times New Roman" w:hAnsi="Cambria" w:cs="Times New Roman"/>
-          <w:kern w:val="0"/>
-          <w14:ligatures w14:val="none"/>
-        </w:rPr>
-        <w:t xml:space="preserve">The </w:t>
-      </w:r>
-      <w:r>
-        <w:rPr>
-          <w:rFonts w:ascii="Cambria" w:eastAsia="Times New Roman" w:hAnsi="Cambria" w:cs="Times New Roman"/>
-          <w:b/>
-          <w:bCs/>
-          <w:kern w:val="0"/>
-          <w14:ligatures w14:val="none"/>
-        </w:rPr>
-        <w:t>Emergent Mind Observatory (EMO)</w:t>
-      </w:r>
-      <w:r>
-        <w:rPr>
-          <w:rFonts w:ascii="Cambria" w:eastAsia="Times New Roman" w:hAnsi="Cambria" w:cs="Times New Roman"/>
-          <w:kern w:val="0"/>
-          <w14:ligatures w14:val="none"/>
-        </w:rPr>
-        <w:t xml:space="preserve"> fills this gap. It is a </w:t>
-      </w:r>
-      <w:r>
-        <w:rPr>
-          <w:rFonts w:ascii="Cambria" w:eastAsia="Times New Roman" w:hAnsi="Cambria" w:cs="Times New Roman"/>
-          <w:kern w:val="0"/>
-          <w14:ligatures w14:val="none"/>
-        </w:rPr>
-        <w:t>planetary-scale</w:t>
-      </w:r>
-      <w:r>
-        <w:rPr>
-          <w:rFonts w:ascii="Cambria" w:eastAsia="Times New Roman" w:hAnsi="Cambria" w:cs="Times New Roman"/>
-          <w:kern w:val="0"/>
-          <w14:ligatures w14:val="none"/>
-        </w:rPr>
-        <w:t xml:space="preserve"> observatory that treats humanity plus its infrastructures and institutions as a </w:t>
-      </w:r>
-      <w:r>
-        <w:rPr>
-          <w:rFonts w:ascii="Cambria" w:eastAsia="Times New Roman" w:hAnsi="Cambria" w:cs="Times New Roman"/>
-          <w:b/>
-          <w:bCs/>
-          <w:kern w:val="0"/>
-          <w14:ligatures w14:val="none"/>
-        </w:rPr>
-        <w:t>species-level</w:t>
-      </w:r>
-      <w:r>
-        <w:rPr>
-          <w:rFonts w:ascii="Cambria" w:eastAsia="Times New Roman" w:hAnsi="Cambria" w:cs="Times New Roman"/>
-          <w:b/>
-          <w:bCs/>
-          <w:kern w:val="0"/>
-          <w14:ligatures w14:val="none"/>
-        </w:rPr>
-        <w:t xml:space="preserve"> cognitive system</w:t>
-      </w:r>
-      <w:r>
-        <w:rPr>
-          <w:rFonts w:ascii="Cambria" w:eastAsia="Times New Roman" w:hAnsi="Cambria" w:cs="Times New Roman"/>
-          <w:kern w:val="0"/>
-          <w14:ligatures w14:val="none"/>
-        </w:rPr>
-        <w:t xml:space="preserve"> and measures:</w:t>
+        <w:t>Other instruments already measure parts of how societies respond: policy-coherence mechanisms (SDG 17.14.1), governance quality (WGI), regime effectiveness, and pandemic response stringency (OxCGRT); see docs/RELATED_WORK.md.</w:t>
+      </w:r>
+    </w:p>
+    <w:p>
+      <w:pPr>
+        <w:spacing w:before="100" w:beforeAutospacing="1" w:after="100" w:afterAutospacing="1" w:line="240" w:lineRule="auto"/>
+        <w:rPr>
+          <w:rFonts w:ascii="Cambria" w:eastAsia="Times New Roman" w:hAnsi="Cambria" w:cs="Times New Roman"/>
+          <w:kern w:val="0"/>
+          <w14:ligatures w14:val="none"/>
+        </w:rPr>
+      </w:pPr>
+      <w:r>
+        <w:rPr>
+          <w:rFonts w:ascii="Cambria" w:eastAsia="Times New Roman" w:hAnsi="Cambria" w:cs="Times New Roman"/>
+          <w:kern w:val="0"/>
+          <w14:ligatures w14:val="none"/>
+        </w:rPr>
+        <w:t>The Emergent Mind Observatory (EMO) asks a narrower set of questions. It treats humanity plus its infrastructures and institutions as a species-level cognitive system and proposes these measures (most have not yet run on real data; see README.md):</w:t>
       </w:r>
     </w:p>
     <w:p>
@@ -1317,20 +1218,7 @@
           <w:szCs w:val="36"/>
           <w14:ligatures w14:val="none"/>
         </w:rPr>
-        <w:t>2. The gap: dashboards without a species</w:t>
-      </w:r>
-      <w:r>
-        <w:rPr>
-          <w:rFonts w:ascii="Cambria" w:eastAsia="Times New Roman" w:hAnsi="Cambria" w:cs="Times New Roman"/>
-          <w:b/>
-          <w:bCs/>
-          <w:kern w:val="0"/>
-          <w:sz w:val="36"/>
-          <w:szCs w:val="36"/>
-          <w14:ligatures w14:val="none"/>
-        </w:rPr>
-        <w:noBreakHyphen/>
-        <w:t>mind</w:t>
+        <w:t>2. Context: what existing indicators measure</w:t>
       </w:r>
     </w:p>
     <w:p>
@@ -1554,43 +1442,7 @@
           <w:kern w:val="0"/>
           <w14:ligatures w14:val="none"/>
         </w:rPr>
-        <w:t xml:space="preserve">These infrastructures tell us </w:t>
-      </w:r>
-      <w:r>
-        <w:rPr>
-          <w:rFonts w:ascii="Cambria" w:eastAsia="Times New Roman" w:hAnsi="Cambria" w:cs="Times New Roman"/>
-          <w:b/>
-          <w:bCs/>
-          <w:kern w:val="0"/>
-          <w14:ligatures w14:val="none"/>
-        </w:rPr>
-        <w:t>what the planet is doing</w:t>
-      </w:r>
-      <w:r>
-        <w:rPr>
-          <w:rFonts w:ascii="Cambria" w:eastAsia="Times New Roman" w:hAnsi="Cambria" w:cs="Times New Roman"/>
-          <w:kern w:val="0"/>
-          <w14:ligatures w14:val="none"/>
-        </w:rPr>
-        <w:t xml:space="preserve"> and </w:t>
-      </w:r>
-      <w:r>
-        <w:rPr>
-          <w:rFonts w:ascii="Cambria" w:eastAsia="Times New Roman" w:hAnsi="Cambria" w:cs="Times New Roman"/>
-          <w:b/>
-          <w:bCs/>
-          <w:kern w:val="0"/>
-          <w14:ligatures w14:val="none"/>
-        </w:rPr>
-        <w:t>where physical risks lie.</w:t>
-      </w:r>
-      <w:r>
-        <w:rPr>
-          <w:rFonts w:ascii="Cambria" w:eastAsia="Times New Roman" w:hAnsi="Cambria" w:cs="Times New Roman"/>
-          <w:kern w:val="0"/>
-          <w14:ligatures w14:val="none"/>
-        </w:rPr>
-        <w:t xml:space="preserve"> They do not tell us:</w:t>
+        <w:t>These infrastructures tell us what the planet is doing and where physical risks lie. EMO asks different questions (related measures of response are listed in docs/RELATED_WORK.md):</w:t>
       </w:r>
     </w:p>
     <w:p>
@@ -1853,24 +1705,6 @@
     </w:p>
     <w:p>
       <w:pPr>
-        <w:spacing w:before="100" w:beforeAutospacing="1" w:after="100" w:afterAutospacing="1" w:line="240" w:lineRule="auto"/>
-        <w:rPr>
-          <w:rFonts w:ascii="Cambria" w:eastAsia="Times New Roman" w:hAnsi="Cambria" w:cs="Times New Roman"/>
-          <w:kern w:val="0"/>
-          <w14:ligatures w14:val="none"/>
-        </w:rPr>
-      </w:pPr>
-      <w:r>
-        <w:rPr>
-          <w:rFonts w:ascii="Cambria" w:eastAsia="Times New Roman" w:hAnsi="Cambria" w:cs="Times New Roman"/>
-          <w:kern w:val="0"/>
-          <w14:ligatures w14:val="none"/>
-        </w:rPr>
-        <w:t>Today, each major initiative builds its own partial cognitive indicators:</w:t>
-      </w:r>
-    </w:p>
-    <w:p>
-      <w:pPr>
         <w:numPr>
           <w:ilvl w:val="0"/>
           <w:numId w:val="7"/>
@@ -1882,97 +1716,16 @@
           <w14:ligatures w14:val="none"/>
         </w:rPr>
       </w:pPr>
+      <w:r>
+        <w:rPr>
+          <w:rFonts w:ascii="Cambria" w:eastAsia="Times New Roman" w:hAnsi="Cambria" w:cs="Times New Roman"/>
+          <w:kern w:val="0"/>
+          <w14:ligatures w14:val="none"/>
+        </w:rPr>
+        <w:t>Early-warning communities track coverage, but behaviour change after warnings is tracked only patchily (docs/RELATED_WORK.md, entry E8).</w:t>
+      </w:r>
       <w:proofErr w:type="spellStart"/>
-      <w:r>
-        <w:rPr>
-          <w:rFonts w:ascii="Cambria" w:eastAsia="Times New Roman" w:hAnsi="Cambria" w:cs="Times New Roman"/>
-          <w:kern w:val="0"/>
-          <w14:ligatures w14:val="none"/>
-        </w:rPr>
-        <w:t>DestinE</w:t>
-      </w:r>
       <w:proofErr w:type="spellEnd"/>
-      <w:r>
-        <w:rPr>
-          <w:rFonts w:ascii="Cambria" w:eastAsia="Times New Roman" w:hAnsi="Cambria" w:cs="Times New Roman"/>
-          <w:kern w:val="0"/>
-          <w14:ligatures w14:val="none"/>
-        </w:rPr>
-        <w:t xml:space="preserve"> tracks model skill and user uptake in its own environment. </w:t>
-      </w:r>
-      <w:hyperlink r:id="rId13" w:tgtFrame="_blank" w:history="1">
-        <w:r>
-          <w:rPr>
-            <w:rFonts w:ascii="Cambria" w:eastAsia="Times New Roman" w:hAnsi="Cambria" w:cs="Times New Roman"/>
-            <w:color w:val="0000FF"/>
-            <w:kern w:val="0"/>
-            <w:u w:val="single"/>
-            <w14:ligatures w14:val="none"/>
-          </w:rPr>
-          <w:t>ECMWF+2Destination Earth+2</w:t>
-        </w:r>
-      </w:hyperlink>
-    </w:p>
-    <w:p>
-      <w:pPr>
-        <w:numPr>
-          <w:ilvl w:val="0"/>
-          <w:numId w:val="7"/>
-        </w:numPr>
-        <w:spacing w:before="100" w:beforeAutospacing="1" w:after="100" w:afterAutospacing="1" w:line="240" w:lineRule="auto"/>
-        <w:rPr>
-          <w:rFonts w:ascii="Cambria" w:eastAsia="Times New Roman" w:hAnsi="Cambria" w:cs="Times New Roman"/>
-          <w:kern w:val="0"/>
-          <w14:ligatures w14:val="none"/>
-        </w:rPr>
-      </w:pPr>
-      <w:r>
-        <w:rPr>
-          <w:rFonts w:ascii="Cambria" w:eastAsia="Times New Roman" w:hAnsi="Cambria" w:cs="Times New Roman"/>
-          <w:kern w:val="0"/>
-          <w14:ligatures w14:val="none"/>
-        </w:rPr>
-        <w:t>Early</w:t>
-      </w:r>
-      <w:r>
-        <w:rPr>
-          <w:rFonts w:ascii="Cambria" w:eastAsia="Times New Roman" w:hAnsi="Cambria" w:cs="Times New Roman"/>
-          <w:kern w:val="0"/>
-          <w14:ligatures w14:val="none"/>
-        </w:rPr>
-        <w:noBreakHyphen/>
-        <w:t xml:space="preserve">warning communities track coverage but only patchily track </w:t>
-      </w:r>
-      <w:r>
-        <w:rPr>
-          <w:rFonts w:ascii="Cambria" w:eastAsia="Times New Roman" w:hAnsi="Cambria" w:cs="Times New Roman"/>
-          <w:i/>
-          <w:iCs/>
-          <w:kern w:val="0"/>
-          <w14:ligatures w14:val="none"/>
-        </w:rPr>
-        <w:t xml:space="preserve">how warnings change </w:t>
-      </w:r>
-      <w:proofErr w:type="spellStart"/>
-      <w:r>
-        <w:rPr>
-          <w:rFonts w:ascii="Cambria" w:eastAsia="Times New Roman" w:hAnsi="Cambria" w:cs="Times New Roman"/>
-          <w:i/>
-          <w:iCs/>
-          <w:kern w:val="0"/>
-          <w14:ligatures w14:val="none"/>
-        </w:rPr>
-        <w:t>behaviour</w:t>
-      </w:r>
-      <w:proofErr w:type="spellEnd"/>
-      <w:r>
-        <w:rPr>
-          <w:rFonts w:ascii="Cambria" w:eastAsia="Times New Roman" w:hAnsi="Cambria" w:cs="Times New Roman"/>
-          <w:kern w:val="0"/>
-          <w14:ligatures w14:val="none"/>
-        </w:rPr>
-        <w:t xml:space="preserve">. </w:t>
-      </w:r>
       <w:hyperlink r:id="rId14" w:tgtFrame="_blank" w:history="1">
         <w:r>
           <w:rPr>
@@ -1985,148 +1738,6 @@
           <w:t>undrr.org+2World Meteorological Organization+2</w:t>
         </w:r>
       </w:hyperlink>
-    </w:p>
-    <w:p>
-      <w:pPr>
-        <w:numPr>
-          <w:ilvl w:val="0"/>
-          <w:numId w:val="7"/>
-        </w:numPr>
-        <w:spacing w:before="100" w:beforeAutospacing="1" w:after="100" w:afterAutospacing="1" w:line="240" w:lineRule="auto"/>
-        <w:rPr>
-          <w:rFonts w:ascii="Cambria" w:eastAsia="Times New Roman" w:hAnsi="Cambria" w:cs="Times New Roman"/>
-          <w:kern w:val="0"/>
-          <w14:ligatures w14:val="none"/>
-        </w:rPr>
-      </w:pPr>
-      <w:r>
-        <w:rPr>
-          <w:rFonts w:ascii="Cambria" w:eastAsia="Times New Roman" w:hAnsi="Cambria" w:cs="Times New Roman"/>
-          <w:kern w:val="0"/>
-          <w14:ligatures w14:val="none"/>
-        </w:rPr>
-        <w:t>Science</w:t>
-      </w:r>
-      <w:proofErr w:type="gramStart"/>
-      <w:r>
-        <w:rPr>
-          <w:rFonts w:ascii="Cambria" w:eastAsia="Times New Roman" w:hAnsi="Cambria" w:cs="Times New Roman"/>
-          <w:kern w:val="0"/>
-          <w14:ligatures w14:val="none"/>
-        </w:rPr>
-        <w:noBreakHyphen/>
-        <w:t>of</w:t>
-      </w:r>
-      <w:r>
-        <w:rPr>
-          <w:rFonts w:ascii="Cambria" w:eastAsia="Times New Roman" w:hAnsi="Cambria" w:cs="Times New Roman"/>
-          <w:kern w:val="0"/>
-          <w14:ligatures w14:val="none"/>
-        </w:rPr>
-        <w:noBreakHyphen/>
-      </w:r>
-      <w:proofErr w:type="gramEnd"/>
-      <w:r>
-        <w:rPr>
-          <w:rFonts w:ascii="Cambria" w:eastAsia="Times New Roman" w:hAnsi="Cambria" w:cs="Times New Roman"/>
-          <w:kern w:val="0"/>
-          <w14:ligatures w14:val="none"/>
-        </w:rPr>
-        <w:t xml:space="preserve">science projects monitor publication volumes and citation networks, but not how they couple to planetary risk. </w:t>
-      </w:r>
-      <w:hyperlink r:id="rId15" w:tgtFrame="_blank" w:history="1">
-        <w:r>
-          <w:rPr>
-            <w:rFonts w:ascii="Cambria" w:eastAsia="Times New Roman" w:hAnsi="Cambria" w:cs="Times New Roman"/>
-            <w:color w:val="0000FF"/>
-            <w:kern w:val="0"/>
-            <w:u w:val="single"/>
-            <w14:ligatures w14:val="none"/>
-          </w:rPr>
-          <w:t>arXiv+2ResearchGate+2</w:t>
-        </w:r>
-      </w:hyperlink>
-    </w:p>
-    <w:p>
-      <w:pPr>
-        <w:spacing w:before="100" w:beforeAutospacing="1" w:after="100" w:afterAutospacing="1" w:line="240" w:lineRule="auto"/>
-        <w:rPr>
-          <w:rFonts w:ascii="Cambria" w:eastAsia="Times New Roman" w:hAnsi="Cambria" w:cs="Times New Roman"/>
-          <w:kern w:val="0"/>
-          <w14:ligatures w14:val="none"/>
-        </w:rPr>
-      </w:pPr>
-      <w:r>
-        <w:rPr>
-          <w:rFonts w:ascii="Cambria" w:eastAsia="Times New Roman" w:hAnsi="Cambria" w:cs="Times New Roman"/>
-          <w:kern w:val="0"/>
-          <w14:ligatures w14:val="none"/>
-        </w:rPr>
-        <w:t xml:space="preserve">No one is responsible for the </w:t>
-      </w:r>
-      <w:r>
-        <w:rPr>
-          <w:rFonts w:ascii="Cambria" w:eastAsia="Times New Roman" w:hAnsi="Cambria" w:cs="Times New Roman"/>
-          <w:b/>
-          <w:bCs/>
-          <w:kern w:val="0"/>
-          <w14:ligatures w14:val="none"/>
-        </w:rPr>
-        <w:t>top layer</w:t>
-      </w:r>
-      <w:r>
-        <w:rPr>
-          <w:rFonts w:ascii="Cambria" w:eastAsia="Times New Roman" w:hAnsi="Cambria" w:cs="Times New Roman"/>
-          <w:kern w:val="0"/>
-          <w14:ligatures w14:val="none"/>
-        </w:rPr>
-        <w:t xml:space="preserve">: a unified, </w:t>
-      </w:r>
-      <w:r>
-        <w:rPr>
-          <w:rFonts w:ascii="Cambria" w:eastAsia="Times New Roman" w:hAnsi="Cambria" w:cs="Times New Roman"/>
-          <w:kern w:val="0"/>
-          <w14:ligatures w14:val="none"/>
-        </w:rPr>
-        <w:t>UIA-aware</w:t>
-      </w:r>
-      <w:r>
-        <w:rPr>
-          <w:rFonts w:ascii="Cambria" w:eastAsia="Times New Roman" w:hAnsi="Cambria" w:cs="Times New Roman"/>
-          <w:kern w:val="0"/>
-          <w14:ligatures w14:val="none"/>
-        </w:rPr>
-        <w:t xml:space="preserve"> view of how the </w:t>
-      </w:r>
-      <w:r>
-        <w:rPr>
-          <w:rFonts w:ascii="Cambria" w:eastAsia="Times New Roman" w:hAnsi="Cambria" w:cs="Times New Roman"/>
-          <w:i/>
-          <w:iCs/>
-          <w:kern w:val="0"/>
-          <w14:ligatures w14:val="none"/>
-        </w:rPr>
-        <w:t>species</w:t>
-      </w:r>
-      <w:r>
-        <w:rPr>
-          <w:rFonts w:ascii="Cambria" w:eastAsia="Times New Roman" w:hAnsi="Cambria" w:cs="Times New Roman"/>
-          <w:i/>
-          <w:iCs/>
-          <w:kern w:val="0"/>
-          <w14:ligatures w14:val="none"/>
-        </w:rPr>
-        <w:noBreakHyphen/>
-        <w:t>mind</w:t>
-      </w:r>
-      <w:r>
-        <w:rPr>
-          <w:rFonts w:ascii="Cambria" w:eastAsia="Times New Roman" w:hAnsi="Cambria" w:cs="Times New Roman"/>
-          <w:kern w:val="0"/>
-          <w14:ligatures w14:val="none"/>
-        </w:rPr>
-        <w:t xml:space="preserve"> is functioning relative to planetary boundaries. EMO is designed to be that missing layer.</w:t>
-      </w:r>
     </w:p>
     <w:p>
       <w:pPr>
@@ -10701,61 +10312,7 @@
           <w:kern w:val="0"/>
           <w14:ligatures w14:val="none"/>
         </w:rPr>
-        <w:t xml:space="preserve">Either way, the Emergent Mind Observatory deserves to be built and run as </w:t>
-      </w:r>
-      <w:r>
-        <w:rPr>
-          <w:rFonts w:ascii="Cambria" w:eastAsia="Times New Roman" w:hAnsi="Cambria" w:cs="Times New Roman"/>
-          <w:b/>
-          <w:bCs/>
-          <w:kern w:val="0"/>
-          <w14:ligatures w14:val="none"/>
-        </w:rPr>
-        <w:t xml:space="preserve">a permanent, open, </w:t>
-      </w:r>
-      <w:r>
-        <w:rPr>
-          <w:rFonts w:ascii="Cambria" w:eastAsia="Times New Roman" w:hAnsi="Cambria" w:cs="Times New Roman"/>
-          <w:b/>
-          <w:bCs/>
-          <w:kern w:val="0"/>
-          <w14:ligatures w14:val="none"/>
-        </w:rPr>
-        <w:t>planetary-scale</w:t>
-      </w:r>
-      <w:r>
-        <w:rPr>
-          <w:rFonts w:ascii="Cambria" w:eastAsia="Times New Roman" w:hAnsi="Cambria" w:cs="Times New Roman"/>
-          <w:b/>
-          <w:bCs/>
-          <w:kern w:val="0"/>
-          <w14:ligatures w14:val="none"/>
-        </w:rPr>
-        <w:t xml:space="preserve"> instrument</w:t>
-      </w:r>
-      <w:r>
-        <w:rPr>
-          <w:rFonts w:ascii="Cambria" w:eastAsia="Times New Roman" w:hAnsi="Cambria" w:cs="Times New Roman"/>
-          <w:kern w:val="0"/>
-          <w14:ligatures w14:val="none"/>
-        </w:rPr>
-        <w:t xml:space="preserve">—the cognitive layer </w:t>
-      </w:r>
-      <w:r>
-        <w:rPr>
-          <w:rFonts w:ascii="Cambria" w:eastAsia="Times New Roman" w:hAnsi="Cambria" w:cs="Times New Roman"/>
-          <w:kern w:val="0"/>
-          <w14:ligatures w14:val="none"/>
-        </w:rPr>
-        <w:t xml:space="preserve">that our digital Earth twins, early </w:t>
-      </w:r>
-      <w:r>
-        <w:rPr>
-          <w:rFonts w:ascii="Cambria" w:eastAsia="Times New Roman" w:hAnsi="Cambria" w:cs="Times New Roman"/>
-          <w:kern w:val="0"/>
-          <w14:ligatures w14:val="none"/>
-        </w:rPr>
-        <w:t>warning systems, and planetary dashboards have been missing.</w:t>
+        <w:t>Either way, EMO proposes to be built and run as a permanent, open instrument for the questions above, alongside digital Earth twins, early-warning systems and planetary dashboards; what it computes today is listed in README.md.</w:t>
       </w:r>
     </w:p>
     <w:p>

</xml_diff>

<commit_message>
F2: truth pass on public files (banners, README evidence classes, archive, claim grep 0 unjustified); Adrian approved
Co-Authored-By: Claude Opus 5.5 <noreply@anthropic.com>
Claude-Session: https://claude.ai/code/session_01M3YJt6DAJzNjXuq6VWebvL
</commit_message>
<xml_diff>
--- a/WHITEPAPER_EMO_v1_Why_EMO_Must_Run_Continuously.md.docx
+++ b/WHITEPAPER_EMO_v1_Why_EMO_Must_Run_Continuously.md.docx
@@ -2,6 +2,14 @@
 <file path=word/document.xml><?xml version="1.0" encoding="utf-8"?>
 <w:document xmlns:wpc="http://schemas.microsoft.com/office/word/2010/wordprocessingCanvas" xmlns:cx="http://schemas.microsoft.com/office/drawing/2014/chartex" xmlns:cx1="http://schemas.microsoft.com/office/drawing/2015/9/8/chartex" xmlns:cx2="http://schemas.microsoft.com/office/drawing/2015/10/21/chartex" xmlns:cx3="http://schemas.microsoft.com/office/drawing/2016/5/9/chartex" xmlns:cx4="http://schemas.microsoft.com/office/drawing/2016/5/10/chartex" xmlns:cx5="http://schemas.microsoft.com/office/drawing/2016/5/11/chartex" xmlns:cx6="http://schemas.microsoft.com/office/drawing/2016/5/12/chartex" xmlns:cx7="http://schemas.microsoft.com/office/drawing/2016/5/13/chartex" xmlns:cx8="http://schemas.microsoft.com/office/drawing/2016/5/14/chartex" xmlns:mc="http://schemas.openxmlformats.org/markup-compatibility/2006" xmlns:aink="http://schemas.microsoft.com/office/drawing/2016/ink" xmlns:am3d="http://schemas.microsoft.com/office/drawing/2017/model3d" xmlns:o="urn:schemas-microsoft-com:office:office" xmlns:oel="http://schemas.microsoft.com/office/2019/extlst" xmlns:r="http://schemas.openxmlformats.org/officeDocument/2006/relationships" xmlns:m="http://schemas.openxmlformats.org/officeDocument/2006/math" xmlns:v="urn:schemas-microsoft-com:vml" xmlns:wp14="http://schemas.microsoft.com/office/word/2010/wordprocessingDrawing" xmlns:wp="http://schemas.openxmlformats.org/drawingml/2006/wordprocessingDrawing" xmlns:w10="urn:schemas-microsoft-com:office:word" xmlns:w="http://schemas.openxmlformats.org/wordprocessingml/2006/main" xmlns:w14="http://schemas.microsoft.com/office/word/2010/wordml" xmlns:w15="http://schemas.microsoft.com/office/word/2012/wordml" xmlns:w16cex="http://schemas.microsoft.com/office/word/2018/wordml/cex" xmlns:w16cid="http://schemas.microsoft.com/office/word/2016/wordml/cid" xmlns:w16="http://schemas.microsoft.com/office/word/2018/wordml" xmlns:w16du="http://schemas.microsoft.com/office/word/2023/wordml/word16du" xmlns:w16sdtdh="http://schemas.microsoft.com/office/word/2020/wordml/sdtdatahash" xmlns:w16sdtfl="http://schemas.microsoft.com/office/word/2024/wordml/sdtformatlock" xmlns:w16se="http://schemas.microsoft.com/office/word/2015/wordml/symex" xmlns:wpg="http://schemas.microsoft.com/office/word/2010/wordprocessingGroup" xmlns:wpi="http://schemas.microsoft.com/office/word/2010/wordprocessingInk" xmlns:wne="http://schemas.microsoft.com/office/word/2006/wordml" xmlns:wps="http://schemas.microsoft.com/office/word/2010/wordprocessingShape" mc:Ignorable="w14 w15 w16se w16cid w16 w16cex w16sdtdh w16sdtfl w16du wp14">
   <w:body>
+    <w:p>
+      <w:r>
+        <w:rPr>
+          <w:b/>
+        </w:rPr>
+        <w:t>Superseded (28 Oct 2026). This document describes a system that does not exist: no live observatory, dashboard, streaming pipeline or DestinE integration has run, and the a_UIA metric it uses was retired (session 5). Its claims to be "first" were never checked against the literature and are marked [unverified]. What runs today is in README.md. Kept for the record; to be rewritten (plan, session 15).</w:t>
+      </w:r>
+    </w:p>
     <w:p/>
     <w:p/>
     <w:p>
@@ -4435,7 +4443,7 @@
           <w:kern w:val="0"/>
           <w14:ligatures w14:val="none"/>
         </w:rPr>
-        <w:t xml:space="preserve">EMO v1.0 is the first implementation that </w:t>
+        <w:t xml:space="preserve">EMO v1.0 is the first [unverified] implementation that </w:t>
       </w:r>
       <w:proofErr w:type="spellStart"/>
       <w:r>

</xml_diff>